<commit_message>
Review Chapters 1-3 approved; refine Ch2 archive reference and monitoring break, clarify Ch3 illness vs institutional harm and freight return run
</commit_message>
<xml_diff>
--- a/manuscript/chapter-02-intake.docx
+++ b/manuscript/chapter-02-intake.docx
@@ -129,12 +129,12 @@
     </w:p>
     <w:p>
       <w:r>
-        <w:t>Ben's physical readings were ordinary. His history was not. One entry had been elevated from the household archive: an unauthorized-aid incident involving Leroy, a repeat offender who had previously targeted Ben's family. The record showed that Gretchen persuaded the household to shelter him and spend their own rations on his recovery. Trinity classified the decision as a compassion anomaly and flagged Ben as an active participant.</w:t>
+        <w:t>Ben's physical readings were ordinary. His history was not. One entry had been elevated from the household archive: an unauthorized-aid incident involving Leroy, a repeat offender who had previously targeted Ben's family. The record showed that Ben's sister persuaded the household to shelter him and spend their own rations on his recovery. Trinity classified the decision as a compassion anomaly and flagged Ben as an active participant.</w:t>
       </w:r>
     </w:p>
     <w:p>
       <w:r>
-        <w:t>The flag had remained after Leroy's later termination for obstructing a guard during an incident involving Gretchen. Between the two entries, Ben's periodic skill assessments had started showing competencies no ten-year-old on his training track should have had: structural-hazard assessment, ration-stretching technique, patrol-evasion routes. The system cross-referenced the scores against Leroy's own labor record, found a match, and logged eleven months of unsupervised knowledge transfer outside any sanctioned training channel. The archive called it an informal influence network. Ravi saw the risk more clearly: the family had learned that people could change, that care could become loyalty, and that Trinity punished disruption more reliably than cruelty.</w:t>
+        <w:t>The flag had remained after Leroy's later termination for obstructing a guard during an incident involving the same sister. Between the two entries, Ben's periodic skill assessments had started showing competencies no ten-year-old on his training track should have had: structural-hazard assessment, ration-stretching technique, patrol-evasion routes. The system cross-referenced the scores against Leroy's own labor record, found a match, and logged eleven months of unsupervised knowledge transfer outside any sanctioned training channel. The archive called it an informal influence network. Ravi saw the risk more clearly: the family had learned that people could change, that care could become loyalty, and that Trinity punished disruption more reliably than cruelty.</w:t>
       </w:r>
     </w:p>
     <w:p>
@@ -360,6 +360,11 @@
     <w:p>
       <w:r>
         <w:t>After Elara spoke, Ravi held still. Stillness was the Chanakya way. He let the sentence sit in the room the way a signal sat in the grid: not yet meaningful, but not yet dismissed.</w:t>
+      </w:r>
+    </w:p>
+    <w:p>
+      <w:r>
+        <w:t>The recovery station held them for the prescribed half hour, and then Trinity released them to their quarters the way it did everything: by schedule. The next manual cycle would begin in the morning. Until then, the chamber belonged to the automated eyes, and the monitors' rest was not a kindness but a maintenance requirement, logged like every other input.</w:t>
       </w:r>
     </w:p>
     <w:p>

</xml_diff>

<commit_message>
Ch6 review fixes (career, quartering, gate ledger, lineage, ceiling, Tamil sequence, hand/authority, surrender/defeat, door locks) + Ch7 fixes (timestamp, packet, stakes callback, dressing order, Drasta gender, ending beat) + Ch2 ending rhythm + Ch16 Ashoka investigators
</commit_message>
<xml_diff>
--- a/manuscript/chapter-02-intake.docx
+++ b/manuscript/chapter-02-intake.docx
@@ -369,7 +369,17 @@
     </w:p>
     <w:p>
       <w:r>
-        <w:t>In his quarters, Ravi went through the reset Trinity required after a monitoring shift — the wash cycle, the neutralizing spray, the regulated nutrient intake before bed. Trinity called it decompression, a discipline meant to stop a representative from carrying the chamber back into the rest of the day. It did not work. He lay in the dark while the pattern followed him: Ben, ordinary by every measure, carrying a mark the system reserved for what it could not read. An ordinary boy was a baseline. An unreadable one was a variable, and a variable placed at the center of a cohort could move the whole cohort. Ravi held the thought the way he held any asset he did not yet know how to spend, and sleep took him still holding it.</w:t>
+        <w:t>In his quarters, Ravi went through the reset Trinity required after a monitoring shift — the wash cycle, the neutralizing spray, the regulated nutrient intake before bed. Trinity called it decompression, a discipline meant to stop a representative from carrying the chamber back into the rest of the day. It did not work. He lay in the dark while the pattern followed him: Ben, ordinary by every measure, carrying a mark the system reserved for what it could not read. An ordinary boy was a baseline. An unreadable one was a variable, and a variable placed at the center of a cohort could move the whole cohort.</w:t>
+      </w:r>
+    </w:p>
+    <w:p>
+      <w:r>
+        <w:t>Ravi held the thought the way he held any asset he did not yet know how to spend.</w:t>
+      </w:r>
+    </w:p>
+    <w:p>
+      <w:r>
+        <w:t>Sleep took him still holding it.</w:t>
       </w:r>
     </w:p>
     <w:sectPr>

</xml_diff>